<commit_message>
Add Japan payments project link to Echo Marketing card; make project titles clickable
- ExperienceCard: renders optional projectLink chip on Initiative (→ case study link)
- Echo Marketing Japan payments initiative now links to /projects/echo-japan-payments
- ProjectCard: title h2 wraps in Link when detailHref exists (matches thumbnail behavior)
- Update resume assets

Co-Authored-By: Claude Sonnet 4.6 <noreply@anthropic.com>
</commit_message>
<xml_diff>
--- a/asset/resume.docx
+++ b/asset/resume.docx
@@ -218,14 +218,21 @@
           <w:sz w:val="20"/>
           <w:szCs w:val="20"/>
         </w:rPr>
-        <w:t xml:space="preserve">Proven track record </w:t>
-      </w:r>
-      <w:r>
-        <w:rPr>
-          <w:sz w:val="20"/>
-          <w:szCs w:val="20"/>
-        </w:rPr>
-        <w:t>of</w:t>
+        <w:t>Proven track record of delivering localized payment flows, AI-driven features, and scalable system integrations.</w:t>
+      </w:r>
+      <w:r>
+        <w:rPr>
+          <w:sz w:val="20"/>
+          <w:szCs w:val="20"/>
+        </w:rPr>
+        <w:t xml:space="preserve"> </w:t>
+      </w:r>
+      <w:r>
+        <w:rPr>
+          <w:sz w:val="20"/>
+          <w:szCs w:val="20"/>
+        </w:rPr>
+        <w:t>Leveraging</w:t>
       </w:r>
       <w:r>
         <w:rPr>
@@ -240,116 +247,70 @@
           <w:sz w:val="20"/>
           <w:szCs w:val="20"/>
         </w:rPr>
-        <w:t xml:space="preserve">delivering cross-border payment capabilities, </w:t>
-      </w:r>
-      <w:r>
-        <w:rPr>
-          <w:rFonts w:eastAsiaTheme="minorEastAsia"/>
-          <w:color w:val="000000"/>
-          <w:sz w:val="20"/>
-          <w:szCs w:val="20"/>
-          <w:lang w:val="en-US"/>
-        </w:rPr>
-        <w:t>AI-driven features</w:t>
-      </w:r>
-      <w:r>
-        <w:rPr>
-          <w:sz w:val="20"/>
-          <w:szCs w:val="20"/>
-        </w:rPr>
-        <w:t xml:space="preserve">, and </w:t>
-      </w:r>
-      <w:r>
-        <w:rPr>
-          <w:sz w:val="20"/>
-          <w:szCs w:val="20"/>
-        </w:rPr>
-        <w:t>orchestrating complex API integrations</w:t>
-      </w:r>
-      <w:r>
-        <w:rPr>
-          <w:sz w:val="20"/>
-          <w:szCs w:val="20"/>
-        </w:rPr>
-        <w:t xml:space="preserve">. </w:t>
-      </w:r>
-      <w:r>
-        <w:rPr>
-          <w:sz w:val="20"/>
-          <w:szCs w:val="20"/>
-        </w:rPr>
-        <w:t>Leveraging</w:t>
-      </w:r>
-      <w:r>
-        <w:rPr>
-          <w:rFonts w:hint="eastAsia"/>
+        <w:t xml:space="preserve">an MBA and CFA Level I, I bridge financial acumen with technical </w:t>
+      </w:r>
+      <w:r>
+        <w:rPr>
+          <w:sz w:val="20"/>
+          <w:szCs w:val="20"/>
+        </w:rPr>
+        <w:t>execution</w:t>
+      </w:r>
+      <w:r>
+        <w:rPr>
+          <w:sz w:val="20"/>
+          <w:szCs w:val="20"/>
+        </w:rPr>
+        <w:t xml:space="preserve"> to drive fintech roadmaps grounded in </w:t>
+      </w:r>
+      <w:r>
+        <w:rPr>
+          <w:sz w:val="20"/>
+          <w:szCs w:val="20"/>
+        </w:rPr>
+        <w:t>unit economics</w:t>
+      </w:r>
+      <w:r>
+        <w:rPr>
+          <w:sz w:val="20"/>
+          <w:szCs w:val="20"/>
+        </w:rPr>
+        <w:t xml:space="preserve">, iterative experimentation, and </w:t>
+      </w:r>
+      <w:r>
+        <w:rPr>
+          <w:sz w:val="20"/>
+          <w:szCs w:val="20"/>
+        </w:rPr>
+        <w:t xml:space="preserve">system-level </w:t>
+      </w:r>
+      <w:r>
+        <w:rPr>
+          <w:sz w:val="20"/>
+          <w:szCs w:val="20"/>
+        </w:rPr>
+        <w:t xml:space="preserve">trade-offs </w:t>
+      </w:r>
+      <w:r>
+        <w:rPr>
+          <w:sz w:val="20"/>
+          <w:szCs w:val="20"/>
+        </w:rPr>
+        <w:t>in</w:t>
+      </w:r>
+      <w:r>
+        <w:rPr>
+          <w:sz w:val="20"/>
+          <w:szCs w:val="20"/>
+        </w:rPr>
+        <w:t xml:space="preserve"> high-velocity environments.</w:t>
+      </w:r>
+      <w:r>
+        <w:rPr>
           <w:sz w:val="20"/>
           <w:szCs w:val="20"/>
         </w:rPr>
         <w:t xml:space="preserve"> </w:t>
-      </w:r>
-      <w:r>
-        <w:rPr>
-          <w:sz w:val="20"/>
-          <w:szCs w:val="20"/>
-        </w:rPr>
-        <w:t xml:space="preserve">an MBA and CFA Level I, I bridge financial acumen with technical </w:t>
-      </w:r>
-      <w:r>
-        <w:rPr>
-          <w:sz w:val="20"/>
-          <w:szCs w:val="20"/>
-        </w:rPr>
-        <w:t>execution</w:t>
-      </w:r>
-      <w:r>
-        <w:rPr>
-          <w:sz w:val="20"/>
-          <w:szCs w:val="20"/>
-        </w:rPr>
-        <w:t xml:space="preserve"> to drive fintech roadmaps grounded in </w:t>
-      </w:r>
-      <w:r>
-        <w:rPr>
-          <w:sz w:val="20"/>
-          <w:szCs w:val="20"/>
-        </w:rPr>
-        <w:t>unit economics</w:t>
-      </w:r>
-      <w:r>
-        <w:rPr>
-          <w:sz w:val="20"/>
-          <w:szCs w:val="20"/>
-        </w:rPr>
-        <w:t xml:space="preserve">, iterative experimentation, and </w:t>
-      </w:r>
-      <w:r>
-        <w:rPr>
-          <w:sz w:val="20"/>
-          <w:szCs w:val="20"/>
-        </w:rPr>
-        <w:t xml:space="preserve">system-level </w:t>
-      </w:r>
-      <w:r>
-        <w:rPr>
-          <w:sz w:val="20"/>
-          <w:szCs w:val="20"/>
-        </w:rPr>
-        <w:t xml:space="preserve">trade-offs </w:t>
-      </w:r>
-      <w:r>
-        <w:rPr>
-          <w:sz w:val="20"/>
-          <w:szCs w:val="20"/>
-        </w:rPr>
-        <w:t>in</w:t>
-      </w:r>
-      <w:r>
-        <w:rPr>
-          <w:sz w:val="20"/>
-          <w:szCs w:val="20"/>
-        </w:rPr>
-        <w:t xml:space="preserve"> high-velocity environments.</w:t>
       </w:r>
     </w:p>
     <w:p>
@@ -602,7 +563,6 @@
     <w:p>
       <w:pPr>
         <w:rPr>
-          <w:rFonts w:hint="eastAsia"/>
           <w:iCs/>
           <w:sz w:val="20"/>
           <w:szCs w:val="20"/>
@@ -824,17 +784,17 @@
     <w:p>
       <w:pPr>
         <w:rPr>
-          <w:rFonts w:ascii="Times" w:eastAsia="Times" w:hAnsi="Times" w:cs="Times" w:hint="eastAsia"/>
-          <w:color w:val="000000"/>
-          <w:sz w:val="20"/>
-          <w:szCs w:val="20"/>
-        </w:rPr>
-      </w:pPr>
-    </w:p>
-    <w:p>
-      <w:pPr>
-        <w:rPr>
-          <w:rFonts w:ascii="Times" w:eastAsia="Times" w:hAnsi="Times" w:cs="Times" w:hint="eastAsia"/>
+          <w:rFonts w:ascii="Times" w:eastAsia="Times" w:hAnsi="Times" w:cs="Times"/>
+          <w:color w:val="000000"/>
+          <w:sz w:val="20"/>
+          <w:szCs w:val="20"/>
+        </w:rPr>
+      </w:pPr>
+    </w:p>
+    <w:p>
+      <w:pPr>
+        <w:rPr>
+          <w:rFonts w:ascii="Times" w:eastAsia="Times" w:hAnsi="Times" w:cs="Times"/>
           <w:color w:val="000000"/>
           <w:sz w:val="20"/>
           <w:szCs w:val="20"/>
@@ -918,7 +878,7 @@
     <w:p>
       <w:pPr>
         <w:rPr>
-          <w:rFonts w:ascii="Times" w:eastAsia="Times" w:hAnsi="Times" w:cs="Times" w:hint="eastAsia"/>
+          <w:rFonts w:ascii="Times" w:eastAsia="Times" w:hAnsi="Times" w:cs="Times"/>
           <w:color w:val="000000"/>
           <w:sz w:val="20"/>
           <w:szCs w:val="20"/>
@@ -1134,7 +1094,7 @@
         </w:pBdr>
         <w:ind w:firstLine="360"/>
         <w:rPr>
-          <w:rFonts w:ascii="Times" w:eastAsia="Times" w:hAnsi="Times" w:cs="Times" w:hint="eastAsia"/>
+          <w:rFonts w:ascii="Times" w:eastAsia="Times" w:hAnsi="Times" w:cs="Times"/>
           <w:i/>
           <w:iCs/>
           <w:color w:val="000000"/>
@@ -1282,7 +1242,6 @@
     <w:p>
       <w:pPr>
         <w:rPr>
-          <w:rFonts w:hint="eastAsia"/>
           <w:iCs/>
           <w:sz w:val="20"/>
           <w:szCs w:val="20"/>
@@ -1318,7 +1277,6 @@
     <w:p>
       <w:pPr>
         <w:rPr>
-          <w:rFonts w:hint="eastAsia"/>
           <w:iCs/>
           <w:sz w:val="20"/>
           <w:szCs w:val="20"/>
@@ -1386,7 +1344,6 @@
     <w:p>
       <w:pPr>
         <w:rPr>
-          <w:rFonts w:hint="eastAsia"/>
           <w:sz w:val="20"/>
           <w:szCs w:val="20"/>
         </w:rPr>
@@ -1497,7 +1454,6 @@
           <w:tab w:val="right" w:pos="10800"/>
         </w:tabs>
         <w:rPr>
-          <w:rFonts w:hint="eastAsia"/>
           <w:sz w:val="20"/>
           <w:szCs w:val="20"/>
         </w:rPr>
@@ -1679,7 +1635,6 @@
           <w:tab w:val="right" w:pos="10800"/>
         </w:tabs>
         <w:rPr>
-          <w:rFonts w:hint="eastAsia"/>
           <w:iCs/>
           <w:sz w:val="20"/>
           <w:szCs w:val="20"/>
@@ -1715,7 +1670,6 @@
           <w:tab w:val="right" w:pos="10800"/>
         </w:tabs>
         <w:rPr>
-          <w:rFonts w:hint="eastAsia"/>
           <w:iCs/>
           <w:sz w:val="20"/>
           <w:szCs w:val="20"/>
@@ -1764,7 +1718,6 @@
           <w:tab w:val="right" w:pos="10800"/>
         </w:tabs>
         <w:rPr>
-          <w:rFonts w:hint="eastAsia"/>
           <w:iCs/>
           <w:sz w:val="20"/>
           <w:szCs w:val="20"/>
@@ -1775,7 +1728,6 @@
     <w:p>
       <w:pPr>
         <w:rPr>
-          <w:rFonts w:hint="eastAsia"/>
           <w:iCs/>
           <w:sz w:val="20"/>
           <w:szCs w:val="20"/>
@@ -1900,9 +1852,6 @@
         <w:tabs>
           <w:tab w:val="right" w:pos="10800"/>
         </w:tabs>
-        <w:rPr>
-          <w:rFonts w:hint="eastAsia"/>
-        </w:rPr>
       </w:pPr>
     </w:p>
     <w:p>
@@ -2025,7 +1974,6 @@
           <w:tab w:val="right" w:pos="10800"/>
         </w:tabs>
         <w:rPr>
-          <w:rFonts w:hint="eastAsia"/>
           <w:sz w:val="20"/>
           <w:szCs w:val="20"/>
         </w:rPr>
@@ -2055,7 +2003,6 @@
           <w:tab w:val="right" w:pos="10800"/>
         </w:tabs>
         <w:rPr>
-          <w:rFonts w:hint="eastAsia"/>
           <w:sz w:val="20"/>
           <w:szCs w:val="20"/>
         </w:rPr>
@@ -2093,7 +2040,6 @@
     <w:p>
       <w:pPr>
         <w:rPr>
-          <w:rFonts w:hint="eastAsia"/>
           <w:sz w:val="20"/>
           <w:szCs w:val="20"/>
         </w:rPr>
@@ -2108,42 +2054,40 @@
     </w:p>
     <w:p>
       <w:pPr>
+        <w:pStyle w:val="ListParagraph"/>
         <w:numPr>
           <w:ilvl w:val="0"/>
           <w:numId w:val="2"/>
         </w:numPr>
-        <w:tabs>
-          <w:tab w:val="right" w:pos="10800"/>
-        </w:tabs>
-      </w:pPr>
-      <w:r>
-        <w:rPr>
-          <w:sz w:val="20"/>
-          <w:szCs w:val="20"/>
-        </w:rPr>
-        <w:t xml:space="preserve">Led cross-border payment expansion to Japan by localizing checkout flows, payment methods, and FX display in line with local regulations; </w:t>
-      </w:r>
-      <w:r>
-        <w:rPr>
-          <w:sz w:val="20"/>
-          <w:szCs w:val="20"/>
-        </w:rPr>
-        <w:t>streamlined payment operations across US and Japan, overachieving revenue target by ~25%</w:t>
-      </w:r>
-      <w:r>
-        <w:rPr>
-          <w:rFonts w:hint="eastAsia"/>
-          <w:sz w:val="20"/>
-          <w:szCs w:val="20"/>
-        </w:rPr>
-        <w:t>.</w:t>
-      </w:r>
-      <w:r>
-        <w:rPr>
-          <w:sz w:val="20"/>
-          <w:szCs w:val="20"/>
-        </w:rPr>
-        <w:t xml:space="preserve"> </w:t>
+        <w:rPr>
+          <w:rFonts w:ascii="Times New Roman" w:eastAsia="Times New Roman" w:hAnsi="Times New Roman"/>
+          <w:sz w:val="20"/>
+          <w:lang w:val="en-KR" w:eastAsia="ko-KR"/>
+        </w:rPr>
+      </w:pPr>
+      <w:r>
+        <w:rPr>
+          <w:rFonts w:ascii="Times New Roman" w:eastAsia="Times New Roman" w:hAnsi="Times New Roman"/>
+          <w:sz w:val="20"/>
+          <w:lang w:val="en-KR" w:eastAsia="ko-KR"/>
+        </w:rPr>
+        <w:t>Led payment expansion by localizing payment methods, building async payment flows, and designing inventory and reconciliation logic; enabled seamless checkout</w:t>
+      </w:r>
+      <w:r>
+        <w:rPr>
+          <w:rFonts w:ascii="Times New Roman" w:eastAsia="Times New Roman" w:hAnsi="Times New Roman"/>
+          <w:sz w:val="20"/>
+          <w:lang w:val="en-KR" w:eastAsia="ko-KR"/>
+        </w:rPr>
+        <w:t xml:space="preserve"> for Japanese customers</w:t>
+      </w:r>
+      <w:r>
+        <w:rPr>
+          <w:rFonts w:ascii="Times New Roman" w:eastAsia="Times New Roman" w:hAnsi="Times New Roman"/>
+          <w:sz w:val="20"/>
+          <w:lang w:val="en-KR" w:eastAsia="ko-KR"/>
+        </w:rPr>
+        <w:t>, exceeding revenue target by ~25%.</w:t>
       </w:r>
     </w:p>
     <w:p>
@@ -2152,9 +2096,6 @@
           <w:tab w:val="right" w:pos="10800"/>
         </w:tabs>
         <w:ind w:left="360"/>
-        <w:rPr>
-          <w:rFonts w:hint="eastAsia"/>
-        </w:rPr>
       </w:pPr>
     </w:p>
     <w:p>
@@ -2173,20 +2114,22 @@
     </w:p>
     <w:p>
       <w:pPr>
+        <w:pStyle w:val="ListParagraph"/>
         <w:numPr>
           <w:ilvl w:val="0"/>
           <w:numId w:val="2"/>
         </w:numPr>
-        <w:tabs>
-          <w:tab w:val="right" w:pos="10800"/>
-        </w:tabs>
-      </w:pPr>
-      <w:r>
-        <w:rPr>
-          <w:sz w:val="20"/>
-          <w:szCs w:val="20"/>
-        </w:rPr>
-        <w:t>Built recommendation and ranking logic in collaboration with engineering and data science; leveraged behavioral segmentation and iterative experimentation to improve targeting precision and drive double-digit CTR growth.</w:t>
+        <w:rPr>
+          <w:rFonts w:ascii="Times New Roman" w:eastAsia="Times New Roman" w:hAnsi="Times New Roman"/>
+          <w:sz w:val="20"/>
+          <w:lang w:val="en-KR" w:eastAsia="ko-KR"/>
+        </w:rPr>
+      </w:pPr>
+      <w:r>
+        <w:rPr>
+          <w:sz w:val="20"/>
+        </w:rPr>
+        <w:t>Built personalized recommendation and ranking features leveraging behavioral and demographic segmentation; iterated on logic with data science and engineering to improve targeting precision, resulting in double-digit CTR growth.</w:t>
       </w:r>
     </w:p>
     <w:p>
@@ -2204,49 +2147,14 @@
           <w:sz w:val="20"/>
           <w:szCs w:val="20"/>
         </w:rPr>
-        <w:t xml:space="preserve">Scaled e-commerce platform from the US to Japan, leading market </w:t>
-      </w:r>
-      <w:r>
-        <w:rPr>
-          <w:sz w:val="20"/>
-          <w:szCs w:val="20"/>
-        </w:rPr>
-        <w:t>research</w:t>
-      </w:r>
-      <w:r>
-        <w:rPr>
-          <w:sz w:val="20"/>
-          <w:szCs w:val="20"/>
-        </w:rPr>
-        <w:t xml:space="preserve">, go-to-market strategy and localization across </w:t>
-      </w:r>
-      <w:r>
-        <w:rPr>
-          <w:sz w:val="20"/>
-          <w:szCs w:val="20"/>
-        </w:rPr>
-        <w:t>customer</w:t>
-      </w:r>
-      <w:r>
-        <w:rPr>
-          <w:sz w:val="20"/>
-          <w:szCs w:val="20"/>
-        </w:rPr>
-        <w:t xml:space="preserve"> experience; accelerated </w:t>
-      </w:r>
-      <w:r>
-        <w:rPr>
-          <w:sz w:val="20"/>
-          <w:szCs w:val="20"/>
-        </w:rPr>
-        <w:t>adoption</w:t>
-      </w:r>
-      <w:r>
-        <w:rPr>
-          <w:sz w:val="20"/>
-          <w:szCs w:val="20"/>
-        </w:rPr>
-        <w:t xml:space="preserve"> and surpassed the market penetration target by 30%.</w:t>
+        <w:t>Scaled</w:t>
+      </w:r>
+      <w:r>
+        <w:rPr>
+          <w:sz w:val="20"/>
+          <w:szCs w:val="20"/>
+        </w:rPr>
+        <w:t xml:space="preserve"> platform to Japan, identifying market opportunity through inbound signals and competitive analysis; led end-to-end localization across product, content, and customer experience, surpassing market penetration target by 30%.</w:t>
       </w:r>
     </w:p>
     <w:p>
@@ -2277,6 +2185,7 @@
     </w:p>
     <w:p>
       <w:pPr>
+        <w:pStyle w:val="ListParagraph"/>
         <w:numPr>
           <w:ilvl w:val="0"/>
           <w:numId w:val="2"/>
@@ -2284,11 +2193,14 @@
         <w:tabs>
           <w:tab w:val="right" w:pos="10800"/>
         </w:tabs>
-      </w:pPr>
-      <w:r>
-        <w:rPr>
-          <w:sz w:val="20"/>
-          <w:szCs w:val="20"/>
+        <w:rPr>
+          <w:rFonts w:hint="eastAsia"/>
+          <w:sz w:val="20"/>
+        </w:rPr>
+      </w:pPr>
+      <w:r>
+        <w:rPr>
+          <w:sz w:val="20"/>
         </w:rPr>
         <w:t>Spearheaded a 0-to-1 mobile app launch by owning MVP scope, migration strategy, and end-to-end onboarding; drove 12% growth in DAU and early retention by streamlining the web-to-app transition and simplifying onboarding flows.</w:t>
       </w:r>
@@ -2301,17 +2213,15 @@
         <w:rPr>
           <w:sz w:val="20"/>
           <w:szCs w:val="20"/>
-        </w:rPr>
-      </w:pPr>
-    </w:p>
-    <w:p>
-      <w:pPr>
-        <w:tabs>
-          <w:tab w:val="right" w:pos="10800"/>
-        </w:tabs>
-        <w:rPr>
-          <w:rFonts w:hint="eastAsia"/>
-        </w:rPr>
+          <w:lang w:val="en-US"/>
+        </w:rPr>
+      </w:pPr>
+    </w:p>
+    <w:p>
+      <w:pPr>
+        <w:tabs>
+          <w:tab w:val="right" w:pos="10800"/>
+        </w:tabs>
       </w:pPr>
     </w:p>
     <w:p>
@@ -2468,7 +2378,6 @@
           <w:tab w:val="right" w:pos="10800"/>
         </w:tabs>
         <w:rPr>
-          <w:rFonts w:hint="eastAsia"/>
           <w:sz w:val="20"/>
           <w:szCs w:val="20"/>
           <w:lang w:val="en-US"/>
@@ -2678,7 +2587,6 @@
           <w:tab w:val="right" w:pos="10800"/>
         </w:tabs>
         <w:rPr>
-          <w:rFonts w:hint="eastAsia"/>
           <w:b/>
           <w:sz w:val="10"/>
           <w:szCs w:val="10"/>

</xml_diff>